<commit_message>
Generate SOPs for eng_01/03/04/05; fix photo matching; clean up code
Fixed duplicate/misassigned photos in generate_sop_docx.py (per-photo
timestamps, globally-optimal matching, sponsor-intro exclusion) and
added densify_long_scenes.py for photo-sparse long scenes. Hardened
step_split.py/extract_tools_safety.py with retries and fixed a
step-dropping consolidation bug. Regenerated all 5 SOPs and stripped
docstrings/comments across the scripts.
</commit_message>
<xml_diff>
--- a/reference/English/SOPs/eng_02_SOP.docx
+++ b/reference/English/SOPs/eng_02_SOP.docx
@@ -135,7 +135,7 @@
               <a:graphicData uri="http://schemas.openxmlformats.org/drawingml/2006/picture">
                 <pic:pic>
                   <pic:nvPicPr>
-                    <pic:cNvPr id="0" name="eng_02-Scene-004-01.jpg"/>
+                    <pic:cNvPr id="0" name="eng_02-Scene-003-03.jpg"/>
                     <pic:cNvPicPr/>
                   </pic:nvPicPr>
                   <pic:blipFill>
@@ -164,7 +164,7 @@
           <w:i/>
           <w:sz w:val="18"/>
         </w:rPr>
-        <w:t>Selected image: eng_02-Scene-004-01.jpg</w:t>
+        <w:t>Selected image: eng_02-Scene-003-03.jpg</w:t>
       </w:r>
     </w:p>
     <w:p>
@@ -188,7 +188,7 @@
               <a:graphicData uri="http://schemas.openxmlformats.org/drawingml/2006/picture">
                 <pic:pic>
                   <pic:nvPicPr>
-                    <pic:cNvPr id="0" name="eng_02-Scene-005-01.jpg"/>
+                    <pic:cNvPr id="0" name="eng_02-Scene-005-02.jpg"/>
                     <pic:cNvPicPr/>
                   </pic:nvPicPr>
                   <pic:blipFill>
@@ -217,7 +217,7 @@
           <w:i/>
           <w:sz w:val="18"/>
         </w:rPr>
-        <w:t>Selected image: eng_02-Scene-005-01.jpg</w:t>
+        <w:t>Selected image: eng_02-Scene-005-02.jpg</w:t>
       </w:r>
     </w:p>
     <w:p>
@@ -241,7 +241,7 @@
               <a:graphicData uri="http://schemas.openxmlformats.org/drawingml/2006/picture">
                 <pic:pic>
                   <pic:nvPicPr>
-                    <pic:cNvPr id="0" name="eng_02-Scene-009-01.jpg"/>
+                    <pic:cNvPr id="0" name="eng_02-Scene-008-03.jpg"/>
                     <pic:cNvPicPr/>
                   </pic:nvPicPr>
                   <pic:blipFill>
@@ -270,7 +270,7 @@
           <w:i/>
           <w:sz w:val="18"/>
         </w:rPr>
-        <w:t>Selected image: eng_02-Scene-009-01.jpg</w:t>
+        <w:t>Selected image: eng_02-Scene-008-03.jpg</w:t>
       </w:r>
     </w:p>
     <w:p>
@@ -294,7 +294,7 @@
               <a:graphicData uri="http://schemas.openxmlformats.org/drawingml/2006/picture">
                 <pic:pic>
                   <pic:nvPicPr>
-                    <pic:cNvPr id="0" name="eng_02-Scene-010-01.jpg"/>
+                    <pic:cNvPr id="0" name="eng_02-Scene-009-02.jpg"/>
                     <pic:cNvPicPr/>
                   </pic:nvPicPr>
                   <pic:blipFill>
@@ -323,7 +323,7 @@
           <w:i/>
           <w:sz w:val="18"/>
         </w:rPr>
-        <w:t>Selected image: eng_02-Scene-010-01.jpg</w:t>
+        <w:t>Selected image: eng_02-Scene-009-02.jpg</w:t>
       </w:r>
     </w:p>
     <w:p>
@@ -347,60 +347,7 @@
               <a:graphicData uri="http://schemas.openxmlformats.org/drawingml/2006/picture">
                 <pic:pic>
                   <pic:nvPicPr>
-                    <pic:cNvPr id="0" name="eng_02-Scene-010-01.jpg"/>
-                    <pic:cNvPicPr/>
-                  </pic:nvPicPr>
-                  <pic:blipFill>
-                    <a:blip r:embed="rId12"/>
-                    <a:stretch>
-                      <a:fillRect/>
-                    </a:stretch>
-                  </pic:blipFill>
-                  <pic:spPr>
-                    <a:xfrm>
-                      <a:off x="0" y="0"/>
-                      <a:ext cx="3200400" cy="1800225"/>
-                    </a:xfrm>
-                    <a:prstGeom prst="rect"/>
-                  </pic:spPr>
-                </pic:pic>
-              </a:graphicData>
-            </a:graphic>
-          </wp:inline>
-        </w:drawing>
-      </w:r>
-    </w:p>
-    <w:p>
-      <w:r>
-        <w:rPr>
-          <w:i/>
-          <w:sz w:val="18"/>
-        </w:rPr>
-        <w:t>Selected image: eng_02-Scene-010-01.jpg</w:t>
-      </w:r>
-    </w:p>
-    <w:p>
-      <w:r>
-        <w:rPr>
-          <w:sz w:val="22"/>
-        </w:rPr>
-        <w:t>6. Grab your empty bobbin (at 164.6s)</w:t>
-      </w:r>
-    </w:p>
-    <w:p>
-      <w:r>
-        <w:drawing>
-          <wp:inline xmlns:a="http://schemas.openxmlformats.org/drawingml/2006/main" xmlns:pic="http://schemas.openxmlformats.org/drawingml/2006/picture">
-            <wp:extent cx="3200400" cy="1800225"/>
-            <wp:docPr id="6" name="Picture 6"/>
-            <wp:cNvGraphicFramePr>
-              <a:graphicFrameLocks noChangeAspect="1"/>
-            </wp:cNvGraphicFramePr>
-            <a:graphic>
-              <a:graphicData uri="http://schemas.openxmlformats.org/drawingml/2006/picture">
-                <pic:pic>
-                  <pic:nvPicPr>
-                    <pic:cNvPr id="0" name="eng_02-Scene-013-01.jpg"/>
+                    <pic:cNvPr id="0" name="eng_02-Scene-010-02.jpg"/>
                     <pic:cNvPicPr/>
                   </pic:nvPicPr>
                   <pic:blipFill>
@@ -429,7 +376,7 @@
           <w:i/>
           <w:sz w:val="18"/>
         </w:rPr>
-        <w:t>Selected image: eng_02-Scene-013-01.jpg</w:t>
+        <w:t>Selected image: eng_02-Scene-010-02.jpg</w:t>
       </w:r>
     </w:p>
     <w:p>
@@ -437,7 +384,7 @@
         <w:rPr>
           <w:sz w:val="22"/>
         </w:rPr>
-        <w:t>7. Place bobbin on stub (at 183.7s)</w:t>
+        <w:t>6. Grab your empty bobbin (at 164.6s)</w:t>
       </w:r>
     </w:p>
     <w:p>
@@ -445,7 +392,7 @@
         <w:drawing>
           <wp:inline xmlns:a="http://schemas.openxmlformats.org/drawingml/2006/main" xmlns:pic="http://schemas.openxmlformats.org/drawingml/2006/picture">
             <wp:extent cx="3200400" cy="1800225"/>
-            <wp:docPr id="7" name="Picture 7"/>
+            <wp:docPr id="6" name="Picture 6"/>
             <wp:cNvGraphicFramePr>
               <a:graphicFrameLocks noChangeAspect="1"/>
             </wp:cNvGraphicFramePr>
@@ -453,7 +400,7 @@
               <a:graphicData uri="http://schemas.openxmlformats.org/drawingml/2006/picture">
                 <pic:pic>
                   <pic:nvPicPr>
-                    <pic:cNvPr id="0" name="eng_02-Scene-014-01.jpg"/>
+                    <pic:cNvPr id="0" name="eng_02-Scene-013-02.jpg"/>
                     <pic:cNvPicPr/>
                   </pic:nvPicPr>
                   <pic:blipFill>
@@ -482,7 +429,7 @@
           <w:i/>
           <w:sz w:val="18"/>
         </w:rPr>
-        <w:t>Selected image: eng_02-Scene-014-01.jpg</w:t>
+        <w:t>Selected image: eng_02-Scene-013-02.jpg</w:t>
       </w:r>
     </w:p>
     <w:p>
@@ -490,7 +437,7 @@
         <w:rPr>
           <w:sz w:val="22"/>
         </w:rPr>
-        <w:t>8. Turn the handwheel to enable bobbin threading (at 195.3s)</w:t>
+        <w:t>7. Place bobbin on stub (at 183.7s)</w:t>
       </w:r>
     </w:p>
     <w:p>
@@ -498,7 +445,7 @@
         <w:drawing>
           <wp:inline xmlns:a="http://schemas.openxmlformats.org/drawingml/2006/main" xmlns:pic="http://schemas.openxmlformats.org/drawingml/2006/picture">
             <wp:extent cx="3200400" cy="1800225"/>
-            <wp:docPr id="8" name="Picture 8"/>
+            <wp:docPr id="7" name="Picture 7"/>
             <wp:cNvGraphicFramePr>
               <a:graphicFrameLocks noChangeAspect="1"/>
             </wp:cNvGraphicFramePr>
@@ -506,7 +453,7 @@
               <a:graphicData uri="http://schemas.openxmlformats.org/drawingml/2006/picture">
                 <pic:pic>
                   <pic:nvPicPr>
-                    <pic:cNvPr id="0" name="eng_02-Scene-015-01.jpg"/>
+                    <pic:cNvPr id="0" name="eng_02-Scene-013-04.jpg"/>
                     <pic:cNvPicPr/>
                   </pic:nvPicPr>
                   <pic:blipFill>
@@ -535,7 +482,7 @@
           <w:i/>
           <w:sz w:val="18"/>
         </w:rPr>
-        <w:t>Selected image: eng_02-Scene-015-01.jpg</w:t>
+        <w:t>Selected image: eng_02-Scene-013-04.jpg</w:t>
       </w:r>
     </w:p>
     <w:p>
@@ -543,7 +490,7 @@
         <w:rPr>
           <w:sz w:val="22"/>
         </w:rPr>
-        <w:t>9. Follow the arrow to bring the thread around the bobbin (at 204.7s)</w:t>
+        <w:t>8. Turn the handwheel to enable bobbin threading (at 195.3s)</w:t>
       </w:r>
     </w:p>
     <w:p>
@@ -551,7 +498,7 @@
         <w:drawing>
           <wp:inline xmlns:a="http://schemas.openxmlformats.org/drawingml/2006/main" xmlns:pic="http://schemas.openxmlformats.org/drawingml/2006/picture">
             <wp:extent cx="3200400" cy="1800225"/>
-            <wp:docPr id="9" name="Picture 9"/>
+            <wp:docPr id="8" name="Picture 8"/>
             <wp:cNvGraphicFramePr>
               <a:graphicFrameLocks noChangeAspect="1"/>
             </wp:cNvGraphicFramePr>
@@ -559,7 +506,7 @@
               <a:graphicData uri="http://schemas.openxmlformats.org/drawingml/2006/picture">
                 <pic:pic>
                   <pic:nvPicPr>
-                    <pic:cNvPr id="0" name="eng_02-Scene-016-01.jpg"/>
+                    <pic:cNvPr id="0" name="eng_02-Scene-014-03.jpg"/>
                     <pic:cNvPicPr/>
                   </pic:nvPicPr>
                   <pic:blipFill>
@@ -588,7 +535,60 @@
           <w:i/>
           <w:sz w:val="18"/>
         </w:rPr>
-        <w:t>Selected image: eng_02-Scene-016-01.jpg</w:t>
+        <w:t>Selected image: eng_02-Scene-014-03.jpg</w:t>
+      </w:r>
+    </w:p>
+    <w:p>
+      <w:r>
+        <w:rPr>
+          <w:sz w:val="22"/>
+        </w:rPr>
+        <w:t>9. Follow the arrow to bring the thread around the bobbin (at 204.7s)</w:t>
+      </w:r>
+    </w:p>
+    <w:p>
+      <w:r>
+        <w:drawing>
+          <wp:inline xmlns:a="http://schemas.openxmlformats.org/drawingml/2006/main" xmlns:pic="http://schemas.openxmlformats.org/drawingml/2006/picture">
+            <wp:extent cx="3200400" cy="1800225"/>
+            <wp:docPr id="9" name="Picture 9"/>
+            <wp:cNvGraphicFramePr>
+              <a:graphicFrameLocks noChangeAspect="1"/>
+            </wp:cNvGraphicFramePr>
+            <a:graphic>
+              <a:graphicData uri="http://schemas.openxmlformats.org/drawingml/2006/picture">
+                <pic:pic>
+                  <pic:nvPicPr>
+                    <pic:cNvPr id="0" name="eng_02-Scene-015-03.jpg"/>
+                    <pic:cNvPicPr/>
+                  </pic:nvPicPr>
+                  <pic:blipFill>
+                    <a:blip r:embed="rId17"/>
+                    <a:stretch>
+                      <a:fillRect/>
+                    </a:stretch>
+                  </pic:blipFill>
+                  <pic:spPr>
+                    <a:xfrm>
+                      <a:off x="0" y="0"/>
+                      <a:ext cx="3200400" cy="1800225"/>
+                    </a:xfrm>
+                    <a:prstGeom prst="rect"/>
+                  </pic:spPr>
+                </pic:pic>
+              </a:graphicData>
+            </a:graphic>
+          </wp:inline>
+        </w:drawing>
+      </w:r>
+    </w:p>
+    <w:p>
+      <w:r>
+        <w:rPr>
+          <w:i/>
+          <w:sz w:val="18"/>
+        </w:rPr>
+        <w:t>Selected image: eng_02-Scene-015-03.jpg</w:t>
       </w:r>
     </w:p>
     <w:p>
@@ -616,7 +616,7 @@
                     <pic:cNvPicPr/>
                   </pic:nvPicPr>
                   <pic:blipFill>
-                    <a:blip r:embed="rId16"/>
+                    <a:blip r:embed="rId18"/>
                     <a:stretch>
                       <a:fillRect/>
                     </a:stretch>
@@ -665,166 +665,7 @@
               <a:graphicData uri="http://schemas.openxmlformats.org/drawingml/2006/picture">
                 <pic:pic>
                   <pic:nvPicPr>
-                    <pic:cNvPr id="0" name="eng_02-Scene-017-01.jpg"/>
-                    <pic:cNvPicPr/>
-                  </pic:nvPicPr>
-                  <pic:blipFill>
-                    <a:blip r:embed="rId17"/>
-                    <a:stretch>
-                      <a:fillRect/>
-                    </a:stretch>
-                  </pic:blipFill>
-                  <pic:spPr>
-                    <a:xfrm>
-                      <a:off x="0" y="0"/>
-                      <a:ext cx="3200400" cy="1800225"/>
-                    </a:xfrm>
-                    <a:prstGeom prst="rect"/>
-                  </pic:spPr>
-                </pic:pic>
-              </a:graphicData>
-            </a:graphic>
-          </wp:inline>
-        </w:drawing>
-      </w:r>
-    </w:p>
-    <w:p>
-      <w:r>
-        <w:rPr>
-          <w:i/>
-          <w:sz w:val="18"/>
-        </w:rPr>
-        <w:t>Selected image: eng_02-Scene-017-01.jpg</w:t>
-      </w:r>
-    </w:p>
-    <w:p>
-      <w:r>
-        <w:rPr>
-          <w:sz w:val="22"/>
-        </w:rPr>
-        <w:t>12. Place the thread in one of the bobbin holes (at 231.1s)</w:t>
-      </w:r>
-    </w:p>
-    <w:p>
-      <w:r>
-        <w:drawing>
-          <wp:inline xmlns:a="http://schemas.openxmlformats.org/drawingml/2006/main" xmlns:pic="http://schemas.openxmlformats.org/drawingml/2006/picture">
-            <wp:extent cx="3200400" cy="1800225"/>
-            <wp:docPr id="12" name="Picture 12"/>
-            <wp:cNvGraphicFramePr>
-              <a:graphicFrameLocks noChangeAspect="1"/>
-            </wp:cNvGraphicFramePr>
-            <a:graphic>
-              <a:graphicData uri="http://schemas.openxmlformats.org/drawingml/2006/picture">
-                <pic:pic>
-                  <pic:nvPicPr>
-                    <pic:cNvPr id="0" name="eng_02-Scene-018-01.jpg"/>
-                    <pic:cNvPicPr/>
-                  </pic:nvPicPr>
-                  <pic:blipFill>
-                    <a:blip r:embed="rId18"/>
-                    <a:stretch>
-                      <a:fillRect/>
-                    </a:stretch>
-                  </pic:blipFill>
-                  <pic:spPr>
-                    <a:xfrm>
-                      <a:off x="0" y="0"/>
-                      <a:ext cx="3200400" cy="1800225"/>
-                    </a:xfrm>
-                    <a:prstGeom prst="rect"/>
-                  </pic:spPr>
-                </pic:pic>
-              </a:graphicData>
-            </a:graphic>
-          </wp:inline>
-        </w:drawing>
-      </w:r>
-    </w:p>
-    <w:p>
-      <w:r>
-        <w:rPr>
-          <w:i/>
-          <w:sz w:val="18"/>
-        </w:rPr>
-        <w:t>Selected image: eng_02-Scene-018-01.jpg</w:t>
-      </w:r>
-    </w:p>
-    <w:p>
-      <w:r>
-        <w:rPr>
-          <w:sz w:val="22"/>
-        </w:rPr>
-        <w:t>13. Step on the foot pedal to start winding the bobbin (at 241.2s)</w:t>
-      </w:r>
-    </w:p>
-    <w:p>
-      <w:r>
-        <w:drawing>
-          <wp:inline xmlns:a="http://schemas.openxmlformats.org/drawingml/2006/main" xmlns:pic="http://schemas.openxmlformats.org/drawingml/2006/picture">
-            <wp:extent cx="3200400" cy="1800225"/>
-            <wp:docPr id="13" name="Picture 13"/>
-            <wp:cNvGraphicFramePr>
-              <a:graphicFrameLocks noChangeAspect="1"/>
-            </wp:cNvGraphicFramePr>
-            <a:graphic>
-              <a:graphicData uri="http://schemas.openxmlformats.org/drawingml/2006/picture">
-                <pic:pic>
-                  <pic:nvPicPr>
-                    <pic:cNvPr id="0" name="eng_02-Scene-018-01.jpg"/>
-                    <pic:cNvPicPr/>
-                  </pic:nvPicPr>
-                  <pic:blipFill>
-                    <a:blip r:embed="rId18"/>
-                    <a:stretch>
-                      <a:fillRect/>
-                    </a:stretch>
-                  </pic:blipFill>
-                  <pic:spPr>
-                    <a:xfrm>
-                      <a:off x="0" y="0"/>
-                      <a:ext cx="3200400" cy="1800225"/>
-                    </a:xfrm>
-                    <a:prstGeom prst="rect"/>
-                  </pic:spPr>
-                </pic:pic>
-              </a:graphicData>
-            </a:graphic>
-          </wp:inline>
-        </w:drawing>
-      </w:r>
-    </w:p>
-    <w:p>
-      <w:r>
-        <w:rPr>
-          <w:i/>
-          <w:sz w:val="18"/>
-        </w:rPr>
-        <w:t>Selected image: eng_02-Scene-018-01.jpg</w:t>
-      </w:r>
-    </w:p>
-    <w:p>
-      <w:r>
-        <w:rPr>
-          <w:sz w:val="22"/>
-        </w:rPr>
-        <w:t>14. Switch the stub to the other side when the bobbin is full (at 253.7s)</w:t>
-      </w:r>
-    </w:p>
-    <w:p>
-      <w:r>
-        <w:drawing>
-          <wp:inline xmlns:a="http://schemas.openxmlformats.org/drawingml/2006/main" xmlns:pic="http://schemas.openxmlformats.org/drawingml/2006/picture">
-            <wp:extent cx="3200400" cy="1800225"/>
-            <wp:docPr id="14" name="Picture 14"/>
-            <wp:cNvGraphicFramePr>
-              <a:graphicFrameLocks noChangeAspect="1"/>
-            </wp:cNvGraphicFramePr>
-            <a:graphic>
-              <a:graphicData uri="http://schemas.openxmlformats.org/drawingml/2006/picture">
-                <pic:pic>
-                  <pic:nvPicPr>
-                    <pic:cNvPr id="0" name="eng_02-Scene-019-01.jpg"/>
+                    <pic:cNvPr id="0" name="eng_02-Scene-016-03.jpg"/>
                     <pic:cNvPicPr/>
                   </pic:nvPicPr>
                   <pic:blipFill>
@@ -853,7 +694,7 @@
           <w:i/>
           <w:sz w:val="18"/>
         </w:rPr>
-        <w:t>Selected image: eng_02-Scene-019-01.jpg</w:t>
+        <w:t>Selected image: eng_02-Scene-016-03.jpg</w:t>
       </w:r>
     </w:p>
     <w:p>
@@ -861,7 +702,7 @@
         <w:rPr>
           <w:sz w:val="22"/>
         </w:rPr>
-        <w:t>15. Pull out thread from the bobbin (at 264.9s)</w:t>
+        <w:t>12. Place the thread in one of the bobbin holes (at 231.1s)</w:t>
       </w:r>
     </w:p>
     <w:p>
@@ -869,7 +710,7 @@
         <w:drawing>
           <wp:inline xmlns:a="http://schemas.openxmlformats.org/drawingml/2006/main" xmlns:pic="http://schemas.openxmlformats.org/drawingml/2006/picture">
             <wp:extent cx="3200400" cy="1800225"/>
-            <wp:docPr id="15" name="Picture 15"/>
+            <wp:docPr id="12" name="Picture 12"/>
             <wp:cNvGraphicFramePr>
               <a:graphicFrameLocks noChangeAspect="1"/>
             </wp:cNvGraphicFramePr>
@@ -877,7 +718,7 @@
               <a:graphicData uri="http://schemas.openxmlformats.org/drawingml/2006/picture">
                 <pic:pic>
                   <pic:nvPicPr>
-                    <pic:cNvPr id="0" name="eng_02-Scene-020-01.jpg"/>
+                    <pic:cNvPr id="0" name="eng_02-Scene-017-02.jpg"/>
                     <pic:cNvPicPr/>
                   </pic:nvPicPr>
                   <pic:blipFill>
@@ -906,7 +747,7 @@
           <w:i/>
           <w:sz w:val="18"/>
         </w:rPr>
-        <w:t>Selected image: eng_02-Scene-020-01.jpg</w:t>
+        <w:t>Selected image: eng_02-Scene-017-02.jpg</w:t>
       </w:r>
     </w:p>
     <w:p>
@@ -914,7 +755,7 @@
         <w:rPr>
           <w:sz w:val="22"/>
         </w:rPr>
-        <w:t>16. Turn hand wheel to move the metal hook up (at 294.0s)</w:t>
+        <w:t>13. Step on the foot pedal to start winding the bobbin (at 241.2s)</w:t>
       </w:r>
     </w:p>
     <w:p>
@@ -922,7 +763,7 @@
         <w:drawing>
           <wp:inline xmlns:a="http://schemas.openxmlformats.org/drawingml/2006/main" xmlns:pic="http://schemas.openxmlformats.org/drawingml/2006/picture">
             <wp:extent cx="3200400" cy="1800225"/>
-            <wp:docPr id="16" name="Picture 16"/>
+            <wp:docPr id="13" name="Picture 13"/>
             <wp:cNvGraphicFramePr>
               <a:graphicFrameLocks noChangeAspect="1"/>
             </wp:cNvGraphicFramePr>
@@ -930,7 +771,7 @@
               <a:graphicData uri="http://schemas.openxmlformats.org/drawingml/2006/picture">
                 <pic:pic>
                   <pic:nvPicPr>
-                    <pic:cNvPr id="0" name="eng_02-Scene-023-01.jpg"/>
+                    <pic:cNvPr id="0" name="eng_02-Scene-018-02.jpg"/>
                     <pic:cNvPicPr/>
                   </pic:nvPicPr>
                   <pic:blipFill>
@@ -959,7 +800,166 @@
           <w:i/>
           <w:sz w:val="18"/>
         </w:rPr>
-        <w:t>Selected image: eng_02-Scene-023-01.jpg</w:t>
+        <w:t>Selected image: eng_02-Scene-018-02.jpg</w:t>
+      </w:r>
+    </w:p>
+    <w:p>
+      <w:r>
+        <w:rPr>
+          <w:sz w:val="22"/>
+        </w:rPr>
+        <w:t>14. Switch the stub to the other side when the bobbin is full (at 253.7s)</w:t>
+      </w:r>
+    </w:p>
+    <w:p>
+      <w:r>
+        <w:drawing>
+          <wp:inline xmlns:a="http://schemas.openxmlformats.org/drawingml/2006/main" xmlns:pic="http://schemas.openxmlformats.org/drawingml/2006/picture">
+            <wp:extent cx="3200400" cy="1800225"/>
+            <wp:docPr id="14" name="Picture 14"/>
+            <wp:cNvGraphicFramePr>
+              <a:graphicFrameLocks noChangeAspect="1"/>
+            </wp:cNvGraphicFramePr>
+            <a:graphic>
+              <a:graphicData uri="http://schemas.openxmlformats.org/drawingml/2006/picture">
+                <pic:pic>
+                  <pic:nvPicPr>
+                    <pic:cNvPr id="0" name="eng_02-Scene-019-02.jpg"/>
+                    <pic:cNvPicPr/>
+                  </pic:nvPicPr>
+                  <pic:blipFill>
+                    <a:blip r:embed="rId22"/>
+                    <a:stretch>
+                      <a:fillRect/>
+                    </a:stretch>
+                  </pic:blipFill>
+                  <pic:spPr>
+                    <a:xfrm>
+                      <a:off x="0" y="0"/>
+                      <a:ext cx="3200400" cy="1800225"/>
+                    </a:xfrm>
+                    <a:prstGeom prst="rect"/>
+                  </pic:spPr>
+                </pic:pic>
+              </a:graphicData>
+            </a:graphic>
+          </wp:inline>
+        </w:drawing>
+      </w:r>
+    </w:p>
+    <w:p>
+      <w:r>
+        <w:rPr>
+          <w:i/>
+          <w:sz w:val="18"/>
+        </w:rPr>
+        <w:t>Selected image: eng_02-Scene-019-02.jpg</w:t>
+      </w:r>
+    </w:p>
+    <w:p>
+      <w:r>
+        <w:rPr>
+          <w:sz w:val="22"/>
+        </w:rPr>
+        <w:t>15. Pull out thread from the bobbin (at 264.9s)</w:t>
+      </w:r>
+    </w:p>
+    <w:p>
+      <w:r>
+        <w:drawing>
+          <wp:inline xmlns:a="http://schemas.openxmlformats.org/drawingml/2006/main" xmlns:pic="http://schemas.openxmlformats.org/drawingml/2006/picture">
+            <wp:extent cx="3200400" cy="1800225"/>
+            <wp:docPr id="15" name="Picture 15"/>
+            <wp:cNvGraphicFramePr>
+              <a:graphicFrameLocks noChangeAspect="1"/>
+            </wp:cNvGraphicFramePr>
+            <a:graphic>
+              <a:graphicData uri="http://schemas.openxmlformats.org/drawingml/2006/picture">
+                <pic:pic>
+                  <pic:nvPicPr>
+                    <pic:cNvPr id="0" name="eng_02-Scene-020-02.jpg"/>
+                    <pic:cNvPicPr/>
+                  </pic:nvPicPr>
+                  <pic:blipFill>
+                    <a:blip r:embed="rId23"/>
+                    <a:stretch>
+                      <a:fillRect/>
+                    </a:stretch>
+                  </pic:blipFill>
+                  <pic:spPr>
+                    <a:xfrm>
+                      <a:off x="0" y="0"/>
+                      <a:ext cx="3200400" cy="1800225"/>
+                    </a:xfrm>
+                    <a:prstGeom prst="rect"/>
+                  </pic:spPr>
+                </pic:pic>
+              </a:graphicData>
+            </a:graphic>
+          </wp:inline>
+        </w:drawing>
+      </w:r>
+    </w:p>
+    <w:p>
+      <w:r>
+        <w:rPr>
+          <w:i/>
+          <w:sz w:val="18"/>
+        </w:rPr>
+        <w:t>Selected image: eng_02-Scene-020-02.jpg</w:t>
+      </w:r>
+    </w:p>
+    <w:p>
+      <w:r>
+        <w:rPr>
+          <w:sz w:val="22"/>
+        </w:rPr>
+        <w:t>16. Turn hand wheel to move the metal hook up (at 294.0s)</w:t>
+      </w:r>
+    </w:p>
+    <w:p>
+      <w:r>
+        <w:drawing>
+          <wp:inline xmlns:a="http://schemas.openxmlformats.org/drawingml/2006/main" xmlns:pic="http://schemas.openxmlformats.org/drawingml/2006/picture">
+            <wp:extent cx="3200400" cy="1800225"/>
+            <wp:docPr id="16" name="Picture 16"/>
+            <wp:cNvGraphicFramePr>
+              <a:graphicFrameLocks noChangeAspect="1"/>
+            </wp:cNvGraphicFramePr>
+            <a:graphic>
+              <a:graphicData uri="http://schemas.openxmlformats.org/drawingml/2006/picture">
+                <pic:pic>
+                  <pic:nvPicPr>
+                    <pic:cNvPr id="0" name="eng_02-Scene-022-03.jpg"/>
+                    <pic:cNvPicPr/>
+                  </pic:nvPicPr>
+                  <pic:blipFill>
+                    <a:blip r:embed="rId24"/>
+                    <a:stretch>
+                      <a:fillRect/>
+                    </a:stretch>
+                  </pic:blipFill>
+                  <pic:spPr>
+                    <a:xfrm>
+                      <a:off x="0" y="0"/>
+                      <a:ext cx="3200400" cy="1800225"/>
+                    </a:xfrm>
+                    <a:prstGeom prst="rect"/>
+                  </pic:spPr>
+                </pic:pic>
+              </a:graphicData>
+            </a:graphic>
+          </wp:inline>
+        </w:drawing>
+      </w:r>
+    </w:p>
+    <w:p>
+      <w:r>
+        <w:rPr>
+          <w:i/>
+          <w:sz w:val="18"/>
+        </w:rPr>
+        <w:t>Selected image: eng_02-Scene-022-03.jpg</w:t>
       </w:r>
     </w:p>
     <w:p>
@@ -987,7 +987,7 @@
                     <pic:cNvPicPr/>
                   </pic:nvPicPr>
                   <pic:blipFill>
-                    <a:blip r:embed="rId21"/>
+                    <a:blip r:embed="rId25"/>
                     <a:stretch>
                       <a:fillRect/>
                     </a:stretch>
@@ -1036,11 +1036,11 @@
               <a:graphicData uri="http://schemas.openxmlformats.org/drawingml/2006/picture">
                 <pic:pic>
                   <pic:nvPicPr>
-                    <pic:cNvPr id="0" name="eng_02-Scene-024-01.jpg"/>
+                    <pic:cNvPr id="0" name="eng_02-Scene-023-03.jpg"/>
                     <pic:cNvPicPr/>
                   </pic:nvPicPr>
                   <pic:blipFill>
-                    <a:blip r:embed="rId22"/>
+                    <a:blip r:embed="rId26"/>
                     <a:stretch>
                       <a:fillRect/>
                     </a:stretch>
@@ -1065,7 +1065,7 @@
           <w:i/>
           <w:sz w:val="18"/>
         </w:rPr>
-        <w:t>Selected image: eng_02-Scene-024-01.jpg</w:t>
+        <w:t>Selected image: eng_02-Scene-023-03.jpg</w:t>
       </w:r>
     </w:p>
     <w:p>
@@ -1093,7 +1093,7 @@
                     <pic:cNvPicPr/>
                   </pic:nvPicPr>
                   <pic:blipFill>
-                    <a:blip r:embed="rId22"/>
+                    <a:blip r:embed="rId27"/>
                     <a:stretch>
                       <a:fillRect/>
                     </a:stretch>
@@ -1142,431 +1142,7 @@
               <a:graphicData uri="http://schemas.openxmlformats.org/drawingml/2006/picture">
                 <pic:pic>
                   <pic:nvPicPr>
-                    <pic:cNvPr id="0" name="eng_02-Scene-024-01.jpg"/>
-                    <pic:cNvPicPr/>
-                  </pic:nvPicPr>
-                  <pic:blipFill>
-                    <a:blip r:embed="rId22"/>
-                    <a:stretch>
-                      <a:fillRect/>
-                    </a:stretch>
-                  </pic:blipFill>
-                  <pic:spPr>
-                    <a:xfrm>
-                      <a:off x="0" y="0"/>
-                      <a:ext cx="3200400" cy="1800225"/>
-                    </a:xfrm>
-                    <a:prstGeom prst="rect"/>
-                  </pic:spPr>
-                </pic:pic>
-              </a:graphicData>
-            </a:graphic>
-          </wp:inline>
-        </w:drawing>
-      </w:r>
-    </w:p>
-    <w:p>
-      <w:r>
-        <w:rPr>
-          <w:i/>
-          <w:sz w:val="18"/>
-        </w:rPr>
-        <w:t>Selected image: eng_02-Scene-024-01.jpg</w:t>
-      </w:r>
-    </w:p>
-    <w:p>
-      <w:r>
-        <w:rPr>
-          <w:sz w:val="22"/>
-        </w:rPr>
-        <w:t>21. Pull bobbin thread up with left hand (at 323.1s)</w:t>
-      </w:r>
-    </w:p>
-    <w:p>
-      <w:r>
-        <w:drawing>
-          <wp:inline xmlns:a="http://schemas.openxmlformats.org/drawingml/2006/main" xmlns:pic="http://schemas.openxmlformats.org/drawingml/2006/picture">
-            <wp:extent cx="3200400" cy="1800225"/>
-            <wp:docPr id="21" name="Picture 21"/>
-            <wp:cNvGraphicFramePr>
-              <a:graphicFrameLocks noChangeAspect="1"/>
-            </wp:cNvGraphicFramePr>
-            <a:graphic>
-              <a:graphicData uri="http://schemas.openxmlformats.org/drawingml/2006/picture">
-                <pic:pic>
-                  <pic:nvPicPr>
-                    <pic:cNvPr id="0" name="eng_02-Scene-025-01.jpg"/>
-                    <pic:cNvPicPr/>
-                  </pic:nvPicPr>
-                  <pic:blipFill>
-                    <a:blip r:embed="rId23"/>
-                    <a:stretch>
-                      <a:fillRect/>
-                    </a:stretch>
-                  </pic:blipFill>
-                  <pic:spPr>
-                    <a:xfrm>
-                      <a:off x="0" y="0"/>
-                      <a:ext cx="3200400" cy="1800225"/>
-                    </a:xfrm>
-                    <a:prstGeom prst="rect"/>
-                  </pic:spPr>
-                </pic:pic>
-              </a:graphicData>
-            </a:graphic>
-          </wp:inline>
-        </w:drawing>
-      </w:r>
-    </w:p>
-    <w:p>
-      <w:r>
-        <w:rPr>
-          <w:i/>
-          <w:sz w:val="18"/>
-        </w:rPr>
-        <w:t>Selected image: eng_02-Scene-025-01.jpg</w:t>
-      </w:r>
-    </w:p>
-    <w:p>
-      <w:r>
-        <w:rPr>
-          <w:sz w:val="22"/>
-        </w:rPr>
-        <w:t>22. Lower presser foot after sewing to the corner (at 436.5s)</w:t>
-      </w:r>
-    </w:p>
-    <w:p>
-      <w:r>
-        <w:drawing>
-          <wp:inline xmlns:a="http://schemas.openxmlformats.org/drawingml/2006/main" xmlns:pic="http://schemas.openxmlformats.org/drawingml/2006/picture">
-            <wp:extent cx="3200400" cy="1800225"/>
-            <wp:docPr id="22" name="Picture 22"/>
-            <wp:cNvGraphicFramePr>
-              <a:graphicFrameLocks noChangeAspect="1"/>
-            </wp:cNvGraphicFramePr>
-            <a:graphic>
-              <a:graphicData uri="http://schemas.openxmlformats.org/drawingml/2006/picture">
-                <pic:pic>
-                  <pic:nvPicPr>
-                    <pic:cNvPr id="0" name="eng_02-Scene-032-01.jpg"/>
-                    <pic:cNvPicPr/>
-                  </pic:nvPicPr>
-                  <pic:blipFill>
-                    <a:blip r:embed="rId24"/>
-                    <a:stretch>
-                      <a:fillRect/>
-                    </a:stretch>
-                  </pic:blipFill>
-                  <pic:spPr>
-                    <a:xfrm>
-                      <a:off x="0" y="0"/>
-                      <a:ext cx="3200400" cy="1800225"/>
-                    </a:xfrm>
-                    <a:prstGeom prst="rect"/>
-                  </pic:spPr>
-                </pic:pic>
-              </a:graphicData>
-            </a:graphic>
-          </wp:inline>
-        </w:drawing>
-      </w:r>
-    </w:p>
-    <w:p>
-      <w:r>
-        <w:rPr>
-          <w:i/>
-          <w:sz w:val="18"/>
-        </w:rPr>
-        <w:t>Selected image: eng_02-Scene-032-01.jpg</w:t>
-      </w:r>
-    </w:p>
-    <w:p>
-      <w:r>
-        <w:rPr>
-          <w:sz w:val="22"/>
-        </w:rPr>
-        <w:t>23. Turn fabric and continue sewing (at 440.0s)</w:t>
-      </w:r>
-    </w:p>
-    <w:p>
-      <w:r>
-        <w:drawing>
-          <wp:inline xmlns:a="http://schemas.openxmlformats.org/drawingml/2006/main" xmlns:pic="http://schemas.openxmlformats.org/drawingml/2006/picture">
-            <wp:extent cx="3200400" cy="1800225"/>
-            <wp:docPr id="23" name="Picture 23"/>
-            <wp:cNvGraphicFramePr>
-              <a:graphicFrameLocks noChangeAspect="1"/>
-            </wp:cNvGraphicFramePr>
-            <a:graphic>
-              <a:graphicData uri="http://schemas.openxmlformats.org/drawingml/2006/picture">
-                <pic:pic>
-                  <pic:nvPicPr>
-                    <pic:cNvPr id="0" name="eng_02-Scene-032-01.jpg"/>
-                    <pic:cNvPicPr/>
-                  </pic:nvPicPr>
-                  <pic:blipFill>
-                    <a:blip r:embed="rId24"/>
-                    <a:stretch>
-                      <a:fillRect/>
-                    </a:stretch>
-                  </pic:blipFill>
-                  <pic:spPr>
-                    <a:xfrm>
-                      <a:off x="0" y="0"/>
-                      <a:ext cx="3200400" cy="1800225"/>
-                    </a:xfrm>
-                    <a:prstGeom prst="rect"/>
-                  </pic:spPr>
-                </pic:pic>
-              </a:graphicData>
-            </a:graphic>
-          </wp:inline>
-        </w:drawing>
-      </w:r>
-    </w:p>
-    <w:p>
-      <w:r>
-        <w:rPr>
-          <w:i/>
-          <w:sz w:val="18"/>
-        </w:rPr>
-        <w:t>Selected image: eng_02-Scene-032-01.jpg</w:t>
-      </w:r>
-    </w:p>
-    <w:p>
-      <w:r>
-        <w:rPr>
-          <w:sz w:val="22"/>
-        </w:rPr>
-        <w:t>24. Slide fabric under presser foot (at 464.5s)</w:t>
-      </w:r>
-    </w:p>
-    <w:p>
-      <w:r>
-        <w:drawing>
-          <wp:inline xmlns:a="http://schemas.openxmlformats.org/drawingml/2006/main" xmlns:pic="http://schemas.openxmlformats.org/drawingml/2006/picture">
-            <wp:extent cx="3200400" cy="1800225"/>
-            <wp:docPr id="24" name="Picture 24"/>
-            <wp:cNvGraphicFramePr>
-              <a:graphicFrameLocks noChangeAspect="1"/>
-            </wp:cNvGraphicFramePr>
-            <a:graphic>
-              <a:graphicData uri="http://schemas.openxmlformats.org/drawingml/2006/picture">
-                <pic:pic>
-                  <pic:nvPicPr>
-                    <pic:cNvPr id="0" name="eng_02-Scene-034-01.jpg"/>
-                    <pic:cNvPicPr/>
-                  </pic:nvPicPr>
-                  <pic:blipFill>
-                    <a:blip r:embed="rId25"/>
-                    <a:stretch>
-                      <a:fillRect/>
-                    </a:stretch>
-                  </pic:blipFill>
-                  <pic:spPr>
-                    <a:xfrm>
-                      <a:off x="0" y="0"/>
-                      <a:ext cx="3200400" cy="1800225"/>
-                    </a:xfrm>
-                    <a:prstGeom prst="rect"/>
-                  </pic:spPr>
-                </pic:pic>
-              </a:graphicData>
-            </a:graphic>
-          </wp:inline>
-        </w:drawing>
-      </w:r>
-    </w:p>
-    <w:p>
-      <w:r>
-        <w:rPr>
-          <w:i/>
-          <w:sz w:val="18"/>
-        </w:rPr>
-        <w:t>Selected image: eng_02-Scene-034-01.jpg</w:t>
-      </w:r>
-    </w:p>
-    <w:p>
-      <w:r>
-        <w:rPr>
-          <w:sz w:val="22"/>
-        </w:rPr>
-        <w:t>25. Align fabric with seam allowance (at 468.9s)</w:t>
-      </w:r>
-    </w:p>
-    <w:p>
-      <w:r>
-        <w:drawing>
-          <wp:inline xmlns:a="http://schemas.openxmlformats.org/drawingml/2006/main" xmlns:pic="http://schemas.openxmlformats.org/drawingml/2006/picture">
-            <wp:extent cx="3200400" cy="1800225"/>
-            <wp:docPr id="25" name="Picture 25"/>
-            <wp:cNvGraphicFramePr>
-              <a:graphicFrameLocks noChangeAspect="1"/>
-            </wp:cNvGraphicFramePr>
-            <a:graphic>
-              <a:graphicData uri="http://schemas.openxmlformats.org/drawingml/2006/picture">
-                <pic:pic>
-                  <pic:nvPicPr>
-                    <pic:cNvPr id="0" name="eng_02-Scene-034-01.jpg"/>
-                    <pic:cNvPicPr/>
-                  </pic:nvPicPr>
-                  <pic:blipFill>
-                    <a:blip r:embed="rId25"/>
-                    <a:stretch>
-                      <a:fillRect/>
-                    </a:stretch>
-                  </pic:blipFill>
-                  <pic:spPr>
-                    <a:xfrm>
-                      <a:off x="0" y="0"/>
-                      <a:ext cx="3200400" cy="1800225"/>
-                    </a:xfrm>
-                    <a:prstGeom prst="rect"/>
-                  </pic:spPr>
-                </pic:pic>
-              </a:graphicData>
-            </a:graphic>
-          </wp:inline>
-        </w:drawing>
-      </w:r>
-    </w:p>
-    <w:p>
-      <w:r>
-        <w:rPr>
-          <w:i/>
-          <w:sz w:val="18"/>
-        </w:rPr>
-        <w:t>Selected image: eng_02-Scene-034-01.jpg</w:t>
-      </w:r>
-    </w:p>
-    <w:p>
-      <w:r>
-        <w:rPr>
-          <w:sz w:val="22"/>
-        </w:rPr>
-        <w:t>26. Mark seam lines with chalk or disappearing ink pen (at 476.5s)</w:t>
-      </w:r>
-    </w:p>
-    <w:p>
-      <w:r>
-        <w:drawing>
-          <wp:inline xmlns:a="http://schemas.openxmlformats.org/drawingml/2006/main" xmlns:pic="http://schemas.openxmlformats.org/drawingml/2006/picture">
-            <wp:extent cx="3200400" cy="1800225"/>
-            <wp:docPr id="26" name="Picture 26"/>
-            <wp:cNvGraphicFramePr>
-              <a:graphicFrameLocks noChangeAspect="1"/>
-            </wp:cNvGraphicFramePr>
-            <a:graphic>
-              <a:graphicData uri="http://schemas.openxmlformats.org/drawingml/2006/picture">
-                <pic:pic>
-                  <pic:nvPicPr>
-                    <pic:cNvPr id="0" name="eng_02-Scene-035-01.jpg"/>
-                    <pic:cNvPicPr/>
-                  </pic:nvPicPr>
-                  <pic:blipFill>
-                    <a:blip r:embed="rId26"/>
-                    <a:stretch>
-                      <a:fillRect/>
-                    </a:stretch>
-                  </pic:blipFill>
-                  <pic:spPr>
-                    <a:xfrm>
-                      <a:off x="0" y="0"/>
-                      <a:ext cx="3200400" cy="1800225"/>
-                    </a:xfrm>
-                    <a:prstGeom prst="rect"/>
-                  </pic:spPr>
-                </pic:pic>
-              </a:graphicData>
-            </a:graphic>
-          </wp:inline>
-        </w:drawing>
-      </w:r>
-    </w:p>
-    <w:p>
-      <w:r>
-        <w:rPr>
-          <w:i/>
-          <w:sz w:val="18"/>
-        </w:rPr>
-        <w:t>Selected image: eng_02-Scene-035-01.jpg</w:t>
-      </w:r>
-    </w:p>
-    <w:p>
-      <w:r>
-        <w:rPr>
-          <w:sz w:val="22"/>
-        </w:rPr>
-        <w:t>27. Measure from the needle to the seam allowance (at 514.2s)</w:t>
-      </w:r>
-    </w:p>
-    <w:p>
-      <w:r>
-        <w:drawing>
-          <wp:inline xmlns:a="http://schemas.openxmlformats.org/drawingml/2006/main" xmlns:pic="http://schemas.openxmlformats.org/drawingml/2006/picture">
-            <wp:extent cx="3200400" cy="1800225"/>
-            <wp:docPr id="27" name="Picture 27"/>
-            <wp:cNvGraphicFramePr>
-              <a:graphicFrameLocks noChangeAspect="1"/>
-            </wp:cNvGraphicFramePr>
-            <a:graphic>
-              <a:graphicData uri="http://schemas.openxmlformats.org/drawingml/2006/picture">
-                <pic:pic>
-                  <pic:nvPicPr>
-                    <pic:cNvPr id="0" name="eng_02-Scene-038-01.jpg"/>
-                    <pic:cNvPicPr/>
-                  </pic:nvPicPr>
-                  <pic:blipFill>
-                    <a:blip r:embed="rId27"/>
-                    <a:stretch>
-                      <a:fillRect/>
-                    </a:stretch>
-                  </pic:blipFill>
-                  <pic:spPr>
-                    <a:xfrm>
-                      <a:off x="0" y="0"/>
-                      <a:ext cx="3200400" cy="1800225"/>
-                    </a:xfrm>
-                    <a:prstGeom prst="rect"/>
-                  </pic:spPr>
-                </pic:pic>
-              </a:graphicData>
-            </a:graphic>
-          </wp:inline>
-        </w:drawing>
-      </w:r>
-    </w:p>
-    <w:p>
-      <w:r>
-        <w:rPr>
-          <w:i/>
-          <w:sz w:val="18"/>
-        </w:rPr>
-        <w:t>Selected image: eng_02-Scene-038-01.jpg</w:t>
-      </w:r>
-    </w:p>
-    <w:p>
-      <w:r>
-        <w:rPr>
-          <w:sz w:val="22"/>
-        </w:rPr>
-        <w:t>28. Back stitch whenever you start sewing (at 545.8s)</w:t>
-      </w:r>
-    </w:p>
-    <w:p>
-      <w:r>
-        <w:drawing>
-          <wp:inline xmlns:a="http://schemas.openxmlformats.org/drawingml/2006/main" xmlns:pic="http://schemas.openxmlformats.org/drawingml/2006/picture">
-            <wp:extent cx="3200400" cy="1800225"/>
-            <wp:docPr id="28" name="Picture 28"/>
-            <wp:cNvGraphicFramePr>
-              <a:graphicFrameLocks noChangeAspect="1"/>
-            </wp:cNvGraphicFramePr>
-            <a:graphic>
-              <a:graphicData uri="http://schemas.openxmlformats.org/drawingml/2006/picture">
-                <pic:pic>
-                  <pic:nvPicPr>
-                    <pic:cNvPr id="0" name="eng_02-Scene-041-01.jpg"/>
+                    <pic:cNvPr id="0" name="eng_02-Scene-024-02.jpg"/>
                     <pic:cNvPicPr/>
                   </pic:nvPicPr>
                   <pic:blipFill>
@@ -1595,7 +1171,7 @@
           <w:i/>
           <w:sz w:val="18"/>
         </w:rPr>
-        <w:t>Selected image: eng_02-Scene-041-01.jpg</w:t>
+        <w:t>Selected image: eng_02-Scene-024-02.jpg</w:t>
       </w:r>
     </w:p>
     <w:p>
@@ -1603,7 +1179,7 @@
         <w:rPr>
           <w:sz w:val="22"/>
         </w:rPr>
-        <w:t>29. Back stitch at the end when you finish sewing (at 553.6s)</w:t>
+        <w:t>21. Pull bobbin thread up with left hand (at 323.1s)</w:t>
       </w:r>
     </w:p>
     <w:p>
@@ -1611,7 +1187,7 @@
         <w:drawing>
           <wp:inline xmlns:a="http://schemas.openxmlformats.org/drawingml/2006/main" xmlns:pic="http://schemas.openxmlformats.org/drawingml/2006/picture">
             <wp:extent cx="3200400" cy="1800225"/>
-            <wp:docPr id="29" name="Picture 29"/>
+            <wp:docPr id="21" name="Picture 21"/>
             <wp:cNvGraphicFramePr>
               <a:graphicFrameLocks noChangeAspect="1"/>
             </wp:cNvGraphicFramePr>
@@ -1619,60 +1195,7 @@
               <a:graphicData uri="http://schemas.openxmlformats.org/drawingml/2006/picture">
                 <pic:pic>
                   <pic:nvPicPr>
-                    <pic:cNvPr id="0" name="eng_02-Scene-041-01.jpg"/>
-                    <pic:cNvPicPr/>
-                  </pic:nvPicPr>
-                  <pic:blipFill>
-                    <a:blip r:embed="rId28"/>
-                    <a:stretch>
-                      <a:fillRect/>
-                    </a:stretch>
-                  </pic:blipFill>
-                  <pic:spPr>
-                    <a:xfrm>
-                      <a:off x="0" y="0"/>
-                      <a:ext cx="3200400" cy="1800225"/>
-                    </a:xfrm>
-                    <a:prstGeom prst="rect"/>
-                  </pic:spPr>
-                </pic:pic>
-              </a:graphicData>
-            </a:graphic>
-          </wp:inline>
-        </w:drawing>
-      </w:r>
-    </w:p>
-    <w:p>
-      <w:r>
-        <w:rPr>
-          <w:i/>
-          <w:sz w:val="18"/>
-        </w:rPr>
-        <w:t>Selected image: eng_02-Scene-041-01.jpg</w:t>
-      </w:r>
-    </w:p>
-    <w:p>
-      <w:r>
-        <w:rPr>
-          <w:sz w:val="22"/>
-        </w:rPr>
-        <w:t>30. Sew a couple stitches forward by stepping on your foot pedal (at 565.4s)</w:t>
-      </w:r>
-    </w:p>
-    <w:p>
-      <w:r>
-        <w:drawing>
-          <wp:inline xmlns:a="http://schemas.openxmlformats.org/drawingml/2006/main" xmlns:pic="http://schemas.openxmlformats.org/drawingml/2006/picture">
-            <wp:extent cx="3200400" cy="1800225"/>
-            <wp:docPr id="30" name="Picture 30"/>
-            <wp:cNvGraphicFramePr>
-              <a:graphicFrameLocks noChangeAspect="1"/>
-            </wp:cNvGraphicFramePr>
-            <a:graphic>
-              <a:graphicData uri="http://schemas.openxmlformats.org/drawingml/2006/picture">
-                <pic:pic>
-                  <pic:nvPicPr>
-                    <pic:cNvPr id="0" name="eng_02-Scene-042-01.jpg"/>
+                    <pic:cNvPr id="0" name="eng_02-Scene-024-03.jpg"/>
                     <pic:cNvPicPr/>
                   </pic:nvPicPr>
                   <pic:blipFill>
@@ -1701,7 +1224,7 @@
           <w:i/>
           <w:sz w:val="18"/>
         </w:rPr>
-        <w:t>Selected image: eng_02-Scene-042-01.jpg</w:t>
+        <w:t>Selected image: eng_02-Scene-024-03.jpg</w:t>
       </w:r>
     </w:p>
     <w:p>
@@ -1709,7 +1232,7 @@
         <w:rPr>
           <w:sz w:val="22"/>
         </w:rPr>
-        <w:t>31. Sew a few stitches back by holding the back stitch button (at 570.7s)</w:t>
+        <w:t>22. Lower presser foot after sewing to the corner (at 436.5s)</w:t>
       </w:r>
     </w:p>
     <w:p>
@@ -1717,7 +1240,7 @@
         <w:drawing>
           <wp:inline xmlns:a="http://schemas.openxmlformats.org/drawingml/2006/main" xmlns:pic="http://schemas.openxmlformats.org/drawingml/2006/picture">
             <wp:extent cx="3200400" cy="1800225"/>
-            <wp:docPr id="31" name="Picture 31"/>
+            <wp:docPr id="22" name="Picture 22"/>
             <wp:cNvGraphicFramePr>
               <a:graphicFrameLocks noChangeAspect="1"/>
             </wp:cNvGraphicFramePr>
@@ -1725,11 +1248,11 @@
               <a:graphicData uri="http://schemas.openxmlformats.org/drawingml/2006/picture">
                 <pic:pic>
                   <pic:nvPicPr>
-                    <pic:cNvPr id="0" name="eng_02-Scene-042-01.jpg"/>
+                    <pic:cNvPr id="0" name="eng_02-Scene-031-03.jpg"/>
                     <pic:cNvPicPr/>
                   </pic:nvPicPr>
                   <pic:blipFill>
-                    <a:blip r:embed="rId29"/>
+                    <a:blip r:embed="rId30"/>
                     <a:stretch>
                       <a:fillRect/>
                     </a:stretch>
@@ -1754,7 +1277,7 @@
           <w:i/>
           <w:sz w:val="18"/>
         </w:rPr>
-        <w:t>Selected image: eng_02-Scene-042-01.jpg</w:t>
+        <w:t>Selected image: eng_02-Scene-031-03.jpg</w:t>
       </w:r>
     </w:p>
     <w:p>
@@ -1762,7 +1285,7 @@
         <w:rPr>
           <w:sz w:val="22"/>
         </w:rPr>
-        <w:t>32. Continue sewing the rest of your seam forward (at 574.5s)</w:t>
+        <w:t>23. Turn fabric and continue sewing (at 440.0s)</w:t>
       </w:r>
     </w:p>
     <w:p>
@@ -1770,7 +1293,7 @@
         <w:drawing>
           <wp:inline xmlns:a="http://schemas.openxmlformats.org/drawingml/2006/main" xmlns:pic="http://schemas.openxmlformats.org/drawingml/2006/picture">
             <wp:extent cx="3200400" cy="1800225"/>
-            <wp:docPr id="32" name="Picture 32"/>
+            <wp:docPr id="23" name="Picture 23"/>
             <wp:cNvGraphicFramePr>
               <a:graphicFrameLocks noChangeAspect="1"/>
             </wp:cNvGraphicFramePr>
@@ -1778,11 +1301,11 @@
               <a:graphicData uri="http://schemas.openxmlformats.org/drawingml/2006/picture">
                 <pic:pic>
                   <pic:nvPicPr>
-                    <pic:cNvPr id="0" name="eng_02-Scene-042-01.jpg"/>
+                    <pic:cNvPr id="0" name="eng_02-Scene-032-02.jpg"/>
                     <pic:cNvPicPr/>
                   </pic:nvPicPr>
                   <pic:blipFill>
-                    <a:blip r:embed="rId29"/>
+                    <a:blip r:embed="rId31"/>
                     <a:stretch>
                       <a:fillRect/>
                     </a:stretch>
@@ -1807,7 +1330,484 @@
           <w:i/>
           <w:sz w:val="18"/>
         </w:rPr>
-        <w:t>Selected image: eng_02-Scene-042-01.jpg</w:t>
+        <w:t>Selected image: eng_02-Scene-032-02.jpg</w:t>
+      </w:r>
+    </w:p>
+    <w:p>
+      <w:r>
+        <w:rPr>
+          <w:sz w:val="22"/>
+        </w:rPr>
+        <w:t>24. Slide fabric under presser foot (at 464.5s)</w:t>
+      </w:r>
+    </w:p>
+    <w:p>
+      <w:r>
+        <w:drawing>
+          <wp:inline xmlns:a="http://schemas.openxmlformats.org/drawingml/2006/main" xmlns:pic="http://schemas.openxmlformats.org/drawingml/2006/picture">
+            <wp:extent cx="3200400" cy="1800225"/>
+            <wp:docPr id="24" name="Picture 24"/>
+            <wp:cNvGraphicFramePr>
+              <a:graphicFrameLocks noChangeAspect="1"/>
+            </wp:cNvGraphicFramePr>
+            <a:graphic>
+              <a:graphicData uri="http://schemas.openxmlformats.org/drawingml/2006/picture">
+                <pic:pic>
+                  <pic:nvPicPr>
+                    <pic:cNvPr id="0" name="eng_02-Scene-033-03.jpg"/>
+                    <pic:cNvPicPr/>
+                  </pic:nvPicPr>
+                  <pic:blipFill>
+                    <a:blip r:embed="rId32"/>
+                    <a:stretch>
+                      <a:fillRect/>
+                    </a:stretch>
+                  </pic:blipFill>
+                  <pic:spPr>
+                    <a:xfrm>
+                      <a:off x="0" y="0"/>
+                      <a:ext cx="3200400" cy="1800225"/>
+                    </a:xfrm>
+                    <a:prstGeom prst="rect"/>
+                  </pic:spPr>
+                </pic:pic>
+              </a:graphicData>
+            </a:graphic>
+          </wp:inline>
+        </w:drawing>
+      </w:r>
+    </w:p>
+    <w:p>
+      <w:r>
+        <w:rPr>
+          <w:i/>
+          <w:sz w:val="18"/>
+        </w:rPr>
+        <w:t>Selected image: eng_02-Scene-033-03.jpg</w:t>
+      </w:r>
+    </w:p>
+    <w:p>
+      <w:r>
+        <w:rPr>
+          <w:sz w:val="22"/>
+        </w:rPr>
+        <w:t>25. Align fabric with seam allowance (at 468.9s)</w:t>
+      </w:r>
+    </w:p>
+    <w:p>
+      <w:r>
+        <w:drawing>
+          <wp:inline xmlns:a="http://schemas.openxmlformats.org/drawingml/2006/main" xmlns:pic="http://schemas.openxmlformats.org/drawingml/2006/picture">
+            <wp:extent cx="3200400" cy="1800225"/>
+            <wp:docPr id="25" name="Picture 25"/>
+            <wp:cNvGraphicFramePr>
+              <a:graphicFrameLocks noChangeAspect="1"/>
+            </wp:cNvGraphicFramePr>
+            <a:graphic>
+              <a:graphicData uri="http://schemas.openxmlformats.org/drawingml/2006/picture">
+                <pic:pic>
+                  <pic:nvPicPr>
+                    <pic:cNvPr id="0" name="eng_02-Scene-034-02.jpg"/>
+                    <pic:cNvPicPr/>
+                  </pic:nvPicPr>
+                  <pic:blipFill>
+                    <a:blip r:embed="rId33"/>
+                    <a:stretch>
+                      <a:fillRect/>
+                    </a:stretch>
+                  </pic:blipFill>
+                  <pic:spPr>
+                    <a:xfrm>
+                      <a:off x="0" y="0"/>
+                      <a:ext cx="3200400" cy="1800225"/>
+                    </a:xfrm>
+                    <a:prstGeom prst="rect"/>
+                  </pic:spPr>
+                </pic:pic>
+              </a:graphicData>
+            </a:graphic>
+          </wp:inline>
+        </w:drawing>
+      </w:r>
+    </w:p>
+    <w:p>
+      <w:r>
+        <w:rPr>
+          <w:i/>
+          <w:sz w:val="18"/>
+        </w:rPr>
+        <w:t>Selected image: eng_02-Scene-034-02.jpg</w:t>
+      </w:r>
+    </w:p>
+    <w:p>
+      <w:r>
+        <w:rPr>
+          <w:sz w:val="22"/>
+        </w:rPr>
+        <w:t>26. Mark seam lines with chalk or disappearing ink pen (at 476.5s)</w:t>
+      </w:r>
+    </w:p>
+    <w:p>
+      <w:r>
+        <w:drawing>
+          <wp:inline xmlns:a="http://schemas.openxmlformats.org/drawingml/2006/main" xmlns:pic="http://schemas.openxmlformats.org/drawingml/2006/picture">
+            <wp:extent cx="3200400" cy="1800225"/>
+            <wp:docPr id="26" name="Picture 26"/>
+            <wp:cNvGraphicFramePr>
+              <a:graphicFrameLocks noChangeAspect="1"/>
+            </wp:cNvGraphicFramePr>
+            <a:graphic>
+              <a:graphicData uri="http://schemas.openxmlformats.org/drawingml/2006/picture">
+                <pic:pic>
+                  <pic:nvPicPr>
+                    <pic:cNvPr id="0" name="eng_02-Scene-034-03.jpg"/>
+                    <pic:cNvPicPr/>
+                  </pic:nvPicPr>
+                  <pic:blipFill>
+                    <a:blip r:embed="rId34"/>
+                    <a:stretch>
+                      <a:fillRect/>
+                    </a:stretch>
+                  </pic:blipFill>
+                  <pic:spPr>
+                    <a:xfrm>
+                      <a:off x="0" y="0"/>
+                      <a:ext cx="3200400" cy="1800225"/>
+                    </a:xfrm>
+                    <a:prstGeom prst="rect"/>
+                  </pic:spPr>
+                </pic:pic>
+              </a:graphicData>
+            </a:graphic>
+          </wp:inline>
+        </w:drawing>
+      </w:r>
+    </w:p>
+    <w:p>
+      <w:r>
+        <w:rPr>
+          <w:i/>
+          <w:sz w:val="18"/>
+        </w:rPr>
+        <w:t>Selected image: eng_02-Scene-034-03.jpg</w:t>
+      </w:r>
+    </w:p>
+    <w:p>
+      <w:r>
+        <w:rPr>
+          <w:sz w:val="22"/>
+        </w:rPr>
+        <w:t>27. Measure from the needle to the seam allowance (at 514.2s)</w:t>
+      </w:r>
+    </w:p>
+    <w:p>
+      <w:r>
+        <w:drawing>
+          <wp:inline xmlns:a="http://schemas.openxmlformats.org/drawingml/2006/main" xmlns:pic="http://schemas.openxmlformats.org/drawingml/2006/picture">
+            <wp:extent cx="3200400" cy="1800225"/>
+            <wp:docPr id="27" name="Picture 27"/>
+            <wp:cNvGraphicFramePr>
+              <a:graphicFrameLocks noChangeAspect="1"/>
+            </wp:cNvGraphicFramePr>
+            <a:graphic>
+              <a:graphicData uri="http://schemas.openxmlformats.org/drawingml/2006/picture">
+                <pic:pic>
+                  <pic:nvPicPr>
+                    <pic:cNvPr id="0" name="eng_02-Scene-038-02.jpg"/>
+                    <pic:cNvPicPr/>
+                  </pic:nvPicPr>
+                  <pic:blipFill>
+                    <a:blip r:embed="rId35"/>
+                    <a:stretch>
+                      <a:fillRect/>
+                    </a:stretch>
+                  </pic:blipFill>
+                  <pic:spPr>
+                    <a:xfrm>
+                      <a:off x="0" y="0"/>
+                      <a:ext cx="3200400" cy="1800225"/>
+                    </a:xfrm>
+                    <a:prstGeom prst="rect"/>
+                  </pic:spPr>
+                </pic:pic>
+              </a:graphicData>
+            </a:graphic>
+          </wp:inline>
+        </w:drawing>
+      </w:r>
+    </w:p>
+    <w:p>
+      <w:r>
+        <w:rPr>
+          <w:i/>
+          <w:sz w:val="18"/>
+        </w:rPr>
+        <w:t>Selected image: eng_02-Scene-038-02.jpg</w:t>
+      </w:r>
+    </w:p>
+    <w:p>
+      <w:r>
+        <w:rPr>
+          <w:sz w:val="22"/>
+        </w:rPr>
+        <w:t>28. Back stitch whenever you start sewing (at 545.8s)</w:t>
+      </w:r>
+    </w:p>
+    <w:p>
+      <w:r>
+        <w:drawing>
+          <wp:inline xmlns:a="http://schemas.openxmlformats.org/drawingml/2006/main" xmlns:pic="http://schemas.openxmlformats.org/drawingml/2006/picture">
+            <wp:extent cx="3200400" cy="1800225"/>
+            <wp:docPr id="28" name="Picture 28"/>
+            <wp:cNvGraphicFramePr>
+              <a:graphicFrameLocks noChangeAspect="1"/>
+            </wp:cNvGraphicFramePr>
+            <a:graphic>
+              <a:graphicData uri="http://schemas.openxmlformats.org/drawingml/2006/picture">
+                <pic:pic>
+                  <pic:nvPicPr>
+                    <pic:cNvPr id="0" name="eng_02-Scene-040-03.jpg"/>
+                    <pic:cNvPicPr/>
+                  </pic:nvPicPr>
+                  <pic:blipFill>
+                    <a:blip r:embed="rId36"/>
+                    <a:stretch>
+                      <a:fillRect/>
+                    </a:stretch>
+                  </pic:blipFill>
+                  <pic:spPr>
+                    <a:xfrm>
+                      <a:off x="0" y="0"/>
+                      <a:ext cx="3200400" cy="1800225"/>
+                    </a:xfrm>
+                    <a:prstGeom prst="rect"/>
+                  </pic:spPr>
+                </pic:pic>
+              </a:graphicData>
+            </a:graphic>
+          </wp:inline>
+        </w:drawing>
+      </w:r>
+    </w:p>
+    <w:p>
+      <w:r>
+        <w:rPr>
+          <w:i/>
+          <w:sz w:val="18"/>
+        </w:rPr>
+        <w:t>Selected image: eng_02-Scene-040-03.jpg</w:t>
+      </w:r>
+    </w:p>
+    <w:p>
+      <w:r>
+        <w:rPr>
+          <w:sz w:val="22"/>
+        </w:rPr>
+        <w:t>29. Back stitch at the end when you finish sewing (at 553.6s)</w:t>
+      </w:r>
+    </w:p>
+    <w:p>
+      <w:r>
+        <w:drawing>
+          <wp:inline xmlns:a="http://schemas.openxmlformats.org/drawingml/2006/main" xmlns:pic="http://schemas.openxmlformats.org/drawingml/2006/picture">
+            <wp:extent cx="3200400" cy="1800225"/>
+            <wp:docPr id="29" name="Picture 29"/>
+            <wp:cNvGraphicFramePr>
+              <a:graphicFrameLocks noChangeAspect="1"/>
+            </wp:cNvGraphicFramePr>
+            <a:graphic>
+              <a:graphicData uri="http://schemas.openxmlformats.org/drawingml/2006/picture">
+                <pic:pic>
+                  <pic:nvPicPr>
+                    <pic:cNvPr id="0" name="eng_02-Scene-041-02.jpg"/>
+                    <pic:cNvPicPr/>
+                  </pic:nvPicPr>
+                  <pic:blipFill>
+                    <a:blip r:embed="rId37"/>
+                    <a:stretch>
+                      <a:fillRect/>
+                    </a:stretch>
+                  </pic:blipFill>
+                  <pic:spPr>
+                    <a:xfrm>
+                      <a:off x="0" y="0"/>
+                      <a:ext cx="3200400" cy="1800225"/>
+                    </a:xfrm>
+                    <a:prstGeom prst="rect"/>
+                  </pic:spPr>
+                </pic:pic>
+              </a:graphicData>
+            </a:graphic>
+          </wp:inline>
+        </w:drawing>
+      </w:r>
+    </w:p>
+    <w:p>
+      <w:r>
+        <w:rPr>
+          <w:i/>
+          <w:sz w:val="18"/>
+        </w:rPr>
+        <w:t>Selected image: eng_02-Scene-041-02.jpg</w:t>
+      </w:r>
+    </w:p>
+    <w:p>
+      <w:r>
+        <w:rPr>
+          <w:sz w:val="22"/>
+        </w:rPr>
+        <w:t>30. Sew a couple stitches forward by stepping on your foot pedal (at 565.4s)</w:t>
+      </w:r>
+    </w:p>
+    <w:p>
+      <w:r>
+        <w:drawing>
+          <wp:inline xmlns:a="http://schemas.openxmlformats.org/drawingml/2006/main" xmlns:pic="http://schemas.openxmlformats.org/drawingml/2006/picture">
+            <wp:extent cx="3200400" cy="1800225"/>
+            <wp:docPr id="30" name="Picture 30"/>
+            <wp:cNvGraphicFramePr>
+              <a:graphicFrameLocks noChangeAspect="1"/>
+            </wp:cNvGraphicFramePr>
+            <a:graphic>
+              <a:graphicData uri="http://schemas.openxmlformats.org/drawingml/2006/picture">
+                <pic:pic>
+                  <pic:nvPicPr>
+                    <pic:cNvPr id="0" name="eng_02-Scene-041-03.jpg"/>
+                    <pic:cNvPicPr/>
+                  </pic:nvPicPr>
+                  <pic:blipFill>
+                    <a:blip r:embed="rId38"/>
+                    <a:stretch>
+                      <a:fillRect/>
+                    </a:stretch>
+                  </pic:blipFill>
+                  <pic:spPr>
+                    <a:xfrm>
+                      <a:off x="0" y="0"/>
+                      <a:ext cx="3200400" cy="1800225"/>
+                    </a:xfrm>
+                    <a:prstGeom prst="rect"/>
+                  </pic:spPr>
+                </pic:pic>
+              </a:graphicData>
+            </a:graphic>
+          </wp:inline>
+        </w:drawing>
+      </w:r>
+    </w:p>
+    <w:p>
+      <w:r>
+        <w:rPr>
+          <w:i/>
+          <w:sz w:val="18"/>
+        </w:rPr>
+        <w:t>Selected image: eng_02-Scene-041-03.jpg</w:t>
+      </w:r>
+    </w:p>
+    <w:p>
+      <w:r>
+        <w:rPr>
+          <w:sz w:val="22"/>
+        </w:rPr>
+        <w:t>31. Sew a few stitches back by holding the back stitch button (at 570.7s)</w:t>
+      </w:r>
+    </w:p>
+    <w:p>
+      <w:r>
+        <w:drawing>
+          <wp:inline xmlns:a="http://schemas.openxmlformats.org/drawingml/2006/main" xmlns:pic="http://schemas.openxmlformats.org/drawingml/2006/picture">
+            <wp:extent cx="3200400" cy="1800225"/>
+            <wp:docPr id="31" name="Picture 31"/>
+            <wp:cNvGraphicFramePr>
+              <a:graphicFrameLocks noChangeAspect="1"/>
+            </wp:cNvGraphicFramePr>
+            <a:graphic>
+              <a:graphicData uri="http://schemas.openxmlformats.org/drawingml/2006/picture">
+                <pic:pic>
+                  <pic:nvPicPr>
+                    <pic:cNvPr id="0" name="eng_02-Scene-042-02.jpg"/>
+                    <pic:cNvPicPr/>
+                  </pic:nvPicPr>
+                  <pic:blipFill>
+                    <a:blip r:embed="rId39"/>
+                    <a:stretch>
+                      <a:fillRect/>
+                    </a:stretch>
+                  </pic:blipFill>
+                  <pic:spPr>
+                    <a:xfrm>
+                      <a:off x="0" y="0"/>
+                      <a:ext cx="3200400" cy="1800225"/>
+                    </a:xfrm>
+                    <a:prstGeom prst="rect"/>
+                  </pic:spPr>
+                </pic:pic>
+              </a:graphicData>
+            </a:graphic>
+          </wp:inline>
+        </w:drawing>
+      </w:r>
+    </w:p>
+    <w:p>
+      <w:r>
+        <w:rPr>
+          <w:i/>
+          <w:sz w:val="18"/>
+        </w:rPr>
+        <w:t>Selected image: eng_02-Scene-042-02.jpg</w:t>
+      </w:r>
+    </w:p>
+    <w:p>
+      <w:r>
+        <w:rPr>
+          <w:sz w:val="22"/>
+        </w:rPr>
+        <w:t>32. Continue sewing the rest of your seam forward (at 574.5s)</w:t>
+      </w:r>
+    </w:p>
+    <w:p>
+      <w:r>
+        <w:drawing>
+          <wp:inline xmlns:a="http://schemas.openxmlformats.org/drawingml/2006/main" xmlns:pic="http://schemas.openxmlformats.org/drawingml/2006/picture">
+            <wp:extent cx="3200400" cy="1800225"/>
+            <wp:docPr id="32" name="Picture 32"/>
+            <wp:cNvGraphicFramePr>
+              <a:graphicFrameLocks noChangeAspect="1"/>
+            </wp:cNvGraphicFramePr>
+            <a:graphic>
+              <a:graphicData uri="http://schemas.openxmlformats.org/drawingml/2006/picture">
+                <pic:pic>
+                  <pic:nvPicPr>
+                    <pic:cNvPr id="0" name="eng_02-Scene-042-03.jpg"/>
+                    <pic:cNvPicPr/>
+                  </pic:nvPicPr>
+                  <pic:blipFill>
+                    <a:blip r:embed="rId40"/>
+                    <a:stretch>
+                      <a:fillRect/>
+                    </a:stretch>
+                  </pic:blipFill>
+                  <pic:spPr>
+                    <a:xfrm>
+                      <a:off x="0" y="0"/>
+                      <a:ext cx="3200400" cy="1800225"/>
+                    </a:xfrm>
+                    <a:prstGeom prst="rect"/>
+                  </pic:spPr>
+                </pic:pic>
+              </a:graphicData>
+            </a:graphic>
+          </wp:inline>
+        </w:drawing>
+      </w:r>
+    </w:p>
+    <w:p>
+      <w:r>
+        <w:rPr>
+          <w:i/>
+          <w:sz w:val="18"/>
+        </w:rPr>
+        <w:t>Selected image: eng_02-Scene-042-03.jpg</w:t>
       </w:r>
     </w:p>
     <w:sectPr>

</xml_diff>